<commit_message>
docs: add a Loom walkthrough script, summarise decisions in the README
The script is structured as six sections with what to show and what to say for
each, and it deliberately gives most weight to the section on what went wrong.
Provisioning infrastructure from a guide is unremarkable; the diagnoses are the
part worth talking through.

The README gains a Key decisions section in bullet form. The reasoning already
lived in the decision records, but the brief asks for it in the README, and a
reader should not have to open eight files to find out why Fargate rather than
EKS. Each entry states the decision, the reason, and what it costs.

Personal tool directories move from .gitignore to .git/info/exclude, which is
where local ignores belong -- a shared .gitignore is for what the project
ignores, not what one contributor's editor leaves behind.
</commit_message>
<xml_diff>
--- a/docs/Challenges-and-Resolutions.docx
+++ b/docs/Challenges-and-Resolutions.docx
@@ -22,7 +22,7 @@
           <w:color w:val="444444"/>
           <w:sz w:val="22"/>
         </w:rPr>
-        <w:t>Meridian Platform - problems encountered during build and deployment, with diagnosis and resolution</w:t>
+        <w:t>Problems encountered during build, deployment and teardown, with diagnosis and resolution</w:t>
       </w:r>
     </w:p>
     <w:p>
@@ -3532,6 +3532,1138 @@
       </w:r>
       <w:r>
         <w:t>. The configuration composes with whatever already exists rather than claiming ownership of it.</w:t>
+      </w:r>
+    </w:p>
+    <w:p>
+      <w:pPr>
+        <w:pBdr>
+          <w:bottom w:val="single" w:sz="6" w:color="BFBFBF"/>
+        </w:pBdr>
+        <w:spacing w:after="120"/>
+      </w:pPr>
+    </w:p>
+    <w:p>
+      <w:pPr>
+        <w:pStyle w:val="Heading2"/>
+      </w:pPr>
+      <w:r>
+        <w:rPr>
+          <w:color w:val="1F3964"/>
+        </w:rPr>
+        <w:t>23. One registry per environment contradicts promoting one artifact</w:t>
+      </w:r>
+    </w:p>
+    <w:p>
+      <w:pPr>
+        <w:spacing w:after="160"/>
+      </w:pPr>
+      <w:r>
+        <w:rPr>
+          <w:b/>
+        </w:rPr>
+        <w:t>Symptom.</w:t>
+      </w:r>
+      <w:r>
+        <w:t xml:space="preserve"> Applying production created a second container registry, </w:t>
+      </w:r>
+      <w:r>
+        <w:rPr>
+          <w:rFonts w:ascii="Consolas" w:hAnsi="Consolas"/>
+          <w:color w:val="A31D1D"/>
+          <w:sz w:val="19"/>
+        </w:rPr>
+        <w:t>meridian-prod</w:t>
+      </w:r>
+      <w:r>
+        <w:t xml:space="preserve">, alongside </w:t>
+      </w:r>
+      <w:r>
+        <w:rPr>
+          <w:rFonts w:ascii="Consolas" w:hAnsi="Consolas"/>
+          <w:color w:val="A31D1D"/>
+          <w:sz w:val="19"/>
+        </w:rPr>
+        <w:t>meridian-staging</w:t>
+      </w:r>
+      <w:r>
+        <w:t>. Nothing ever pushed to it.</w:t>
+      </w:r>
+    </w:p>
+    <w:p>
+      <w:pPr>
+        <w:spacing w:after="160"/>
+      </w:pPr>
+      <w:r>
+        <w:rPr>
+          <w:b/>
+        </w:rPr>
+        <w:t>Diagnosis.</w:t>
+      </w:r>
+      <w:r>
+        <w:t xml:space="preserve"> The compute module created a registry per environment, but the pipeline is built on the opposite idea: build an image once and promote that same artifact through staging to production. Only one of the two registries could ever hold the image being promoted, so the other was dead weight -- and worse than dead weight, because an empty </w:t>
+      </w:r>
+      <w:r>
+        <w:rPr>
+          <w:rFonts w:ascii="Consolas" w:hAnsi="Consolas"/>
+          <w:color w:val="A31D1D"/>
+          <w:sz w:val="19"/>
+        </w:rPr>
+        <w:t>meridian-prod</w:t>
+      </w:r>
+      <w:r>
+        <w:t xml:space="preserve"> invites someone to "fix" it later by rebuilding for production, which is a different artifact however identical the inputs look.</w:t>
+      </w:r>
+    </w:p>
+    <w:p>
+      <w:pPr>
+        <w:spacing w:after="160"/>
+      </w:pPr>
+      <w:r>
+        <w:rPr>
+          <w:b/>
+        </w:rPr>
+        <w:t>Resolution.</w:t>
+      </w:r>
+      <w:r>
+        <w:t xml:space="preserve"> One registry, moved into the delivery configuration alongside the CI roles. It now also outlives environments, so tearing one down no longer destroys the images you would roll back to.</w:t>
+      </w:r>
+    </w:p>
+    <w:p>
+      <w:pPr>
+        <w:pBdr>
+          <w:bottom w:val="single" w:sz="6" w:color="BFBFBF"/>
+        </w:pBdr>
+        <w:spacing w:after="120"/>
+      </w:pPr>
+    </w:p>
+    <w:p>
+      <w:pPr>
+        <w:pStyle w:val="Heading2"/>
+      </w:pPr>
+      <w:r>
+        <w:rPr>
+          <w:color w:val="1F3964"/>
+        </w:rPr>
+        <w:t>24. The pipeline refilled a registry during its own teardown</w:t>
+      </w:r>
+    </w:p>
+    <w:p>
+      <w:pPr>
+        <w:spacing w:after="160"/>
+      </w:pPr>
+      <w:r>
+        <w:rPr>
+          <w:b/>
+        </w:rPr>
+        <w:t>Symptom.</w:t>
+      </w:r>
+      <w:r>
+        <w:t xml:space="preserve"> </w:t>
+      </w:r>
+      <w:r>
+        <w:rPr>
+          <w:rFonts w:ascii="Consolas" w:hAnsi="Consolas"/>
+          <w:color w:val="A31D1D"/>
+          <w:sz w:val="19"/>
+        </w:rPr>
+        <w:t>terraform destroy</w:t>
+      </w:r>
+      <w:r>
+        <w:t xml:space="preserve"> failed on a repository emptied minutes earlier:</w:t>
+      </w:r>
+    </w:p>
+    <w:p>
+      <w:pPr>
+        <w:spacing w:after="0" w:before="0"/>
+        <w:ind w:left="360"/>
+        <w:shd w:val="clear" w:color="auto" w:fill="F2F2F2"/>
+      </w:pPr>
+      <w:r>
+        <w:rPr>
+          <w:rFonts w:ascii="Consolas" w:hAnsi="Consolas"/>
+          <w:sz w:val="18"/>
+        </w:rPr>
+        <w:t>RepositoryNotEmptyException: repository 'meridian-staging' cannot be deleted</w:t>
+      </w:r>
+    </w:p>
+    <w:p>
+      <w:pPr>
+        <w:spacing w:after="0" w:before="0"/>
+        <w:ind w:left="360"/>
+        <w:shd w:val="clear" w:color="auto" w:fill="F2F2F2"/>
+      </w:pPr>
+      <w:r>
+        <w:rPr>
+          <w:rFonts w:ascii="Consolas" w:hAnsi="Consolas"/>
+          <w:sz w:val="18"/>
+        </w:rPr>
+        <w:t>because it still contains images</w:t>
+      </w:r>
+    </w:p>
+    <w:p>
+      <w:pPr>
+        <w:spacing w:after="80"/>
+      </w:pPr>
+    </w:p>
+    <w:p>
+      <w:pPr>
+        <w:spacing w:after="160"/>
+      </w:pPr>
+      <w:r>
+        <w:rPr>
+          <w:b/>
+        </w:rPr>
+        <w:t>Diagnosis.</w:t>
+      </w:r>
+      <w:r>
+        <w:t xml:space="preserve"> Documentation commits pushed to </w:t>
+      </w:r>
+      <w:r>
+        <w:rPr>
+          <w:rFonts w:ascii="Consolas" w:hAnsi="Consolas"/>
+          <w:color w:val="A31D1D"/>
+          <w:sz w:val="19"/>
+        </w:rPr>
+        <w:t>main</w:t>
+      </w:r>
+      <w:r>
+        <w:t xml:space="preserve"> while the teardown was running. Those triggered the delivery workflow, which built and pushed a fresh image into the repository being destroyed.</w:t>
+      </w:r>
+    </w:p>
+    <w:p>
+      <w:pPr>
+        <w:spacing w:after="160"/>
+      </w:pPr>
+      <w:r>
+        <w:rPr>
+          <w:b/>
+        </w:rPr>
+        <w:t>Resolution.</w:t>
+      </w:r>
+      <w:r>
+        <w:t xml:space="preserve"> The runbook now disables the workflow before teardown begins.</w:t>
+      </w:r>
+    </w:p>
+    <w:p>
+      <w:pPr>
+        <w:spacing w:after="160"/>
+      </w:pPr>
+      <w:r>
+        <w:t xml:space="preserve">The general shape is worth naming, because it keeps recurring in this log: the steady state was fine and the </w:t>
+      </w:r>
+      <w:r>
+        <w:rPr>
+          <w:i/>
+        </w:rPr>
+        <w:t>transition</w:t>
+      </w:r>
+      <w:r>
+        <w:t xml:space="preserve"> was not. Entry 9 was an environment whose lifecycle rule only failed at one retention value; entry 11 was the window between infrastructure existing and an image existing; this one is the window between emptying a registry and deleting it. Configuration review examines steady states. Only running the transition finds these.</w:t>
+      </w:r>
+    </w:p>
+    <w:p>
+      <w:pPr>
+        <w:pBdr>
+          <w:bottom w:val="single" w:sz="6" w:color="BFBFBF"/>
+        </w:pBdr>
+        <w:spacing w:after="120"/>
+      </w:pPr>
+    </w:p>
+    <w:p>
+      <w:pPr>
+        <w:pStyle w:val="Heading2"/>
+      </w:pPr>
+      <w:r>
+        <w:rPr>
+          <w:color w:val="1F3964"/>
+        </w:rPr>
+        <w:t>25. A smoke test that could never have passed</w:t>
+      </w:r>
+    </w:p>
+    <w:p>
+      <w:pPr>
+        <w:spacing w:after="160"/>
+      </w:pPr>
+      <w:r>
+        <w:rPr>
+          <w:b/>
+        </w:rPr>
+        <w:t>Symptom.</w:t>
+      </w:r>
+      <w:r>
+        <w:t xml:space="preserve"> CI failed with the container refusing to serve anything:</w:t>
+      </w:r>
+    </w:p>
+    <w:p>
+      <w:pPr>
+        <w:spacing w:after="0" w:before="0"/>
+        <w:ind w:left="360"/>
+        <w:shd w:val="clear" w:color="auto" w:fill="F2F2F2"/>
+      </w:pPr>
+      <w:r>
+        <w:rPr>
+          <w:rFonts w:ascii="Consolas" w:hAnsi="Consolas"/>
+          <w:sz w:val="18"/>
+        </w:rPr>
+        <w:t>curl: (7) Failed to connect to localhost port 8000</w:t>
+      </w:r>
+    </w:p>
+    <w:p>
+      <w:pPr>
+        <w:spacing w:after="0" w:before="0"/>
+        <w:ind w:left="360"/>
+        <w:shd w:val="clear" w:color="auto" w:fill="F2F2F2"/>
+      </w:pPr>
+      <w:r>
+        <w:rPr>
+          <w:rFonts w:ascii="Consolas" w:hAnsi="Consolas"/>
+          <w:sz w:val="18"/>
+        </w:rPr>
+        <w:t>Error: Image failed to serve /health within 60s</w:t>
+      </w:r>
+    </w:p>
+    <w:p>
+      <w:pPr>
+        <w:spacing w:after="80"/>
+      </w:pPr>
+    </w:p>
+    <w:p>
+      <w:pPr>
+        <w:spacing w:after="160"/>
+      </w:pPr>
+      <w:r>
+        <w:rPr>
+          <w:b/>
+        </w:rPr>
+        <w:t>Diagnosis.</w:t>
+      </w:r>
+      <w:r>
+        <w:t xml:space="preserve"> The smoke test started the image with </w:t>
+      </w:r>
+      <w:r>
+        <w:rPr>
+          <w:rFonts w:ascii="Consolas" w:hAnsi="Consolas"/>
+          <w:color w:val="A31D1D"/>
+          <w:sz w:val="19"/>
+        </w:rPr>
+        <w:t>DB_HOST=127.0.0.1</w:t>
+      </w:r>
+      <w:r>
+        <w:t xml:space="preserve"> and nothing listening, on the reasoning that </w:t>
+      </w:r>
+      <w:r>
+        <w:rPr>
+          <w:rFonts w:ascii="Consolas" w:hAnsi="Consolas"/>
+          <w:color w:val="A31D1D"/>
+          <w:sz w:val="19"/>
+        </w:rPr>
+        <w:t>/health</w:t>
+      </w:r>
+      <w:r>
+        <w:t xml:space="preserve"> deliberately does not query the database. The reasoning was wrong in a way worth recording: startup is fail-fast by design, so schema initialisation exhausted its retries, uvicorn exited, and </w:t>
+      </w:r>
+      <w:r>
+        <w:rPr>
+          <w:rFonts w:ascii="Consolas" w:hAnsi="Consolas"/>
+          <w:color w:val="A31D1D"/>
+          <w:sz w:val="19"/>
+        </w:rPr>
+        <w:t>/health</w:t>
+      </w:r>
+      <w:r>
+        <w:t xml:space="preserve"> was never served at all. The endpoint not </w:t>
+      </w:r>
+      <w:r>
+        <w:rPr>
+          <w:i/>
+        </w:rPr>
+        <w:t>needing</w:t>
+      </w:r>
+      <w:r>
+        <w:t xml:space="preserve"> a database does not mean the process can </w:t>
+      </w:r>
+      <w:r>
+        <w:rPr>
+          <w:i/>
+        </w:rPr>
+        <w:t>start</w:t>
+      </w:r>
+      <w:r>
+        <w:t xml:space="preserve"> without one.</w:t>
+      </w:r>
+    </w:p>
+    <w:p>
+      <w:pPr>
+        <w:spacing w:after="160"/>
+      </w:pPr>
+      <w:r>
+        <w:t>It had also never actually run before. Earlier builds failed at the image scan, one step before it, so the step had been present and unexercised for days -- green-looking because it never got a chance to be red.</w:t>
+      </w:r>
+    </w:p>
+    <w:p>
+      <w:pPr>
+        <w:spacing w:after="160"/>
+      </w:pPr>
+      <w:r>
+        <w:rPr>
+          <w:b/>
+        </w:rPr>
+        <w:t>Resolution.</w:t>
+      </w:r>
+      <w:r>
+        <w:t xml:space="preserve"> The smoke test now runs a real PostgreSQL container on a shared Docker network, and additionally asserts </w:t>
+      </w:r>
+      <w:r>
+        <w:rPr>
+          <w:rFonts w:ascii="Consolas" w:hAnsi="Consolas"/>
+          <w:color w:val="A31D1D"/>
+          <w:sz w:val="19"/>
+        </w:rPr>
+        <w:t>/readyz</w:t>
+      </w:r>
+      <w:r>
+        <w:t>, which exercises the database leg the previous version could not reach.</w:t>
+      </w:r>
+    </w:p>
+    <w:p>
+      <w:pPr>
+        <w:pBdr>
+          <w:bottom w:val="single" w:sz="6" w:color="BFBFBF"/>
+        </w:pBdr>
+        <w:spacing w:after="120"/>
+      </w:pPr>
+    </w:p>
+    <w:p>
+      <w:pPr>
+        <w:pStyle w:val="Heading2"/>
+      </w:pPr>
+      <w:r>
+        <w:rPr>
+          <w:color w:val="1F3964"/>
+        </w:rPr>
+        <w:t>26. An orphaned .pth file left a traceback in every log line</w:t>
+      </w:r>
+    </w:p>
+    <w:p>
+      <w:pPr>
+        <w:spacing w:after="160"/>
+      </w:pPr>
+      <w:r>
+        <w:rPr>
+          <w:b/>
+        </w:rPr>
+        <w:t>Symptom.</w:t>
+      </w:r>
+      <w:r>
+        <w:t xml:space="preserve"> Every container start printed:</w:t>
+      </w:r>
+    </w:p>
+    <w:p>
+      <w:pPr>
+        <w:spacing w:after="0" w:before="0"/>
+        <w:ind w:left="360"/>
+        <w:shd w:val="clear" w:color="auto" w:fill="F2F2F2"/>
+      </w:pPr>
+      <w:r>
+        <w:rPr>
+          <w:rFonts w:ascii="Consolas" w:hAnsi="Consolas"/>
+          <w:sz w:val="18"/>
+        </w:rPr>
+        <w:t>Error processing line 1 of /opt/venv/.../distutils-precedence.pth:</w:t>
+      </w:r>
+    </w:p>
+    <w:p>
+      <w:pPr>
+        <w:spacing w:after="0" w:before="0"/>
+        <w:ind w:left="360"/>
+        <w:shd w:val="clear" w:color="auto" w:fill="F2F2F2"/>
+      </w:pPr>
+      <w:r>
+        <w:rPr>
+          <w:rFonts w:ascii="Consolas" w:hAnsi="Consolas"/>
+          <w:sz w:val="18"/>
+        </w:rPr>
+        <w:t xml:space="preserve">  ModuleNotFoundError: No module named '_distutils_hack'</w:t>
+      </w:r>
+    </w:p>
+    <w:p>
+      <w:pPr>
+        <w:spacing w:after="80"/>
+      </w:pPr>
+    </w:p>
+    <w:p>
+      <w:pPr>
+        <w:spacing w:after="160"/>
+      </w:pPr>
+      <w:r>
+        <w:rPr>
+          <w:b/>
+        </w:rPr>
+        <w:t>Diagnosis.</w:t>
+      </w:r>
+      <w:r>
+        <w:t xml:space="preserve"> Removing setuptools from the virtualenv (entry 20) deleted </w:t>
+      </w:r>
+      <w:r>
+        <w:rPr>
+          <w:rFonts w:ascii="Consolas" w:hAnsi="Consolas"/>
+          <w:color w:val="A31D1D"/>
+          <w:sz w:val="19"/>
+        </w:rPr>
+        <w:t>_distutils_hack</w:t>
+      </w:r>
+      <w:r>
+        <w:t xml:space="preserve"> but left </w:t>
+      </w:r>
+      <w:r>
+        <w:rPr>
+          <w:rFonts w:ascii="Consolas" w:hAnsi="Consolas"/>
+          <w:color w:val="A31D1D"/>
+          <w:sz w:val="19"/>
+        </w:rPr>
+        <w:t>distutils-precedence.pth</w:t>
+      </w:r>
+      <w:r>
+        <w:t>, which imports it at every interpreter start. Harmless -- Python reports it and continues -- but it interleaved a traceback with the structured JSON logs, which is precisely the noise the structured logging exists to avoid.</w:t>
+      </w:r>
+    </w:p>
+    <w:p>
+      <w:pPr>
+        <w:spacing w:after="160"/>
+      </w:pPr>
+      <w:r>
+        <w:rPr>
+          <w:b/>
+        </w:rPr>
+        <w:t>Resolution.</w:t>
+      </w:r>
+      <w:r>
+        <w:t xml:space="preserve"> Remove the </w:t>
+      </w:r>
+      <w:r>
+        <w:rPr>
+          <w:rFonts w:ascii="Consolas" w:hAnsi="Consolas"/>
+          <w:color w:val="A31D1D"/>
+          <w:sz w:val="19"/>
+        </w:rPr>
+        <w:t>.pth</w:t>
+      </w:r>
+      <w:r>
+        <w:t xml:space="preserve"> alongside the module. Deleting a package means deleting what registers it, not only its code.</w:t>
+      </w:r>
+    </w:p>
+    <w:p>
+      <w:pPr>
+        <w:pBdr>
+          <w:bottom w:val="single" w:sz="6" w:color="BFBFBF"/>
+        </w:pBdr>
+        <w:spacing w:after="120"/>
+      </w:pPr>
+    </w:p>
+    <w:p>
+      <w:pPr>
+        <w:pStyle w:val="Heading2"/>
+      </w:pPr>
+      <w:r>
+        <w:rPr>
+          <w:color w:val="1F3964"/>
+        </w:rPr>
+        <w:t>27. A permission scoped to a name pattern the resource stopped matching</w:t>
+      </w:r>
+    </w:p>
+    <w:p>
+      <w:pPr>
+        <w:spacing w:after="160"/>
+      </w:pPr>
+      <w:r>
+        <w:rPr>
+          <w:b/>
+        </w:rPr>
+        <w:t>Symptom.</w:t>
+      </w:r>
+      <w:r>
+        <w:t xml:space="preserve"> The delivery pipeline built and scanned the image, then failed to push it:</w:t>
+      </w:r>
+    </w:p>
+    <w:p>
+      <w:pPr>
+        <w:spacing w:after="0" w:before="0"/>
+        <w:ind w:left="360"/>
+        <w:shd w:val="clear" w:color="auto" w:fill="F2F2F2"/>
+      </w:pPr>
+      <w:r>
+        <w:rPr>
+          <w:rFonts w:ascii="Consolas" w:hAnsi="Consolas"/>
+          <w:sz w:val="18"/>
+        </w:rPr>
+        <w:t>User: .../meridian-github-build is not authorized to perform:</w:t>
+      </w:r>
+    </w:p>
+    <w:p>
+      <w:pPr>
+        <w:spacing w:after="0" w:before="0"/>
+        <w:ind w:left="360"/>
+        <w:shd w:val="clear" w:color="auto" w:fill="F2F2F2"/>
+      </w:pPr>
+      <w:r>
+        <w:rPr>
+          <w:rFonts w:ascii="Consolas" w:hAnsi="Consolas"/>
+          <w:sz w:val="18"/>
+        </w:rPr>
+        <w:t>ecr:InitiateLayerUpload on resource: .../repository/meridian</w:t>
+      </w:r>
+    </w:p>
+    <w:p>
+      <w:pPr>
+        <w:spacing w:after="80"/>
+      </w:pPr>
+    </w:p>
+    <w:p>
+      <w:pPr>
+        <w:spacing w:after="160"/>
+      </w:pPr>
+      <w:r>
+        <w:rPr>
+          <w:b/>
+        </w:rPr>
+        <w:t>Diagnosis.</w:t>
+      </w:r>
+      <w:r>
+        <w:t xml:space="preserve"> The build role granted ECR push on </w:t>
+      </w:r>
+      <w:r>
+        <w:rPr>
+          <w:rFonts w:ascii="Consolas" w:hAnsi="Consolas"/>
+          <w:color w:val="A31D1D"/>
+          <w:sz w:val="19"/>
+        </w:rPr>
+        <w:t>arn:aws:ecr:*:&lt;account&gt;:repository/meridian-*</w:t>
+      </w:r>
+      <w:r>
+        <w:t xml:space="preserve">. That matched the old per-environment repositories, </w:t>
+      </w:r>
+      <w:r>
+        <w:rPr>
+          <w:rFonts w:ascii="Consolas" w:hAnsi="Consolas"/>
+          <w:color w:val="A31D1D"/>
+          <w:sz w:val="19"/>
+        </w:rPr>
+        <w:t>meridian-staging</w:t>
+      </w:r>
+      <w:r>
+        <w:t xml:space="preserve"> and </w:t>
+      </w:r>
+      <w:r>
+        <w:rPr>
+          <w:rFonts w:ascii="Consolas" w:hAnsi="Consolas"/>
+          <w:color w:val="A31D1D"/>
+          <w:sz w:val="19"/>
+        </w:rPr>
+        <w:t>meridian-prod</w:t>
+      </w:r>
+      <w:r>
+        <w:t xml:space="preserve">. Entry 23 replaced them with one shared repository named exactly </w:t>
+      </w:r>
+      <w:r>
+        <w:rPr>
+          <w:rFonts w:ascii="Consolas" w:hAnsi="Consolas"/>
+          <w:color w:val="A31D1D"/>
+          <w:sz w:val="19"/>
+        </w:rPr>
+        <w:t>meridian</w:t>
+      </w:r>
+      <w:r>
+        <w:t xml:space="preserve"> -- which the pattern </w:t>
+      </w:r>
+      <w:r>
+        <w:rPr>
+          <w:rFonts w:ascii="Consolas" w:hAnsi="Consolas"/>
+          <w:color w:val="A31D1D"/>
+          <w:sz w:val="19"/>
+        </w:rPr>
+        <w:t>meridian-*</w:t>
+      </w:r>
+      <w:r>
+        <w:t xml:space="preserve"> does not match, because it requires the hyphen.</w:t>
+      </w:r>
+    </w:p>
+    <w:p>
+      <w:pPr>
+        <w:spacing w:after="160"/>
+      </w:pPr>
+      <w:r>
+        <w:t>Consolidating the registry and scoping the permission were the same change, made in the same commit, and the second half was not revisited.</w:t>
+      </w:r>
+    </w:p>
+    <w:p>
+      <w:pPr>
+        <w:spacing w:after="160"/>
+      </w:pPr>
+      <w:r>
+        <w:rPr>
+          <w:b/>
+        </w:rPr>
+        <w:t>Resolution.</w:t>
+      </w:r>
+      <w:r>
+        <w:t xml:space="preserve"> The repository is now defined in the same configuration as the role, so the policy references </w:t>
+      </w:r>
+      <w:r>
+        <w:rPr>
+          <w:rFonts w:ascii="Consolas" w:hAnsi="Consolas"/>
+          <w:color w:val="A31D1D"/>
+          <w:sz w:val="19"/>
+        </w:rPr>
+        <w:t>aws_ecr_repository.app.arn</w:t>
+      </w:r>
+      <w:r>
+        <w:t xml:space="preserve"> directly. There is no pattern left to drift out of alignment with the thing it is meant to describe.</w:t>
+      </w:r>
+    </w:p>
+    <w:p>
+      <w:pPr>
+        <w:spacing w:after="160"/>
+      </w:pPr>
+      <w:r>
+        <w:t xml:space="preserve">The same pass tightened the deploy role's ECR read permissions, which had been lumped in with </w:t>
+      </w:r>
+      <w:r>
+        <w:rPr>
+          <w:rFonts w:ascii="Consolas" w:hAnsi="Consolas"/>
+          <w:color w:val="A31D1D"/>
+          <w:sz w:val="19"/>
+        </w:rPr>
+        <w:t>GetAuthorizationToken</w:t>
+      </w:r>
+      <w:r>
+        <w:t xml:space="preserve"> and therefore scoped to </w:t>
+      </w:r>
+      <w:r>
+        <w:rPr>
+          <w:rFonts w:ascii="Consolas" w:hAnsi="Consolas"/>
+          <w:color w:val="A31D1D"/>
+          <w:sz w:val="19"/>
+        </w:rPr>
+        <w:t>*</w:t>
+      </w:r>
+      <w:r>
+        <w:t xml:space="preserve">. </w:t>
+      </w:r>
+      <w:r>
+        <w:rPr>
+          <w:rFonts w:ascii="Consolas" w:hAnsi="Consolas"/>
+          <w:color w:val="A31D1D"/>
+          <w:sz w:val="19"/>
+        </w:rPr>
+        <w:t>GetAuthorizationToken</w:t>
+      </w:r>
+      <w:r>
+        <w:t xml:space="preserve"> genuinely accepts no resource ARN; </w:t>
+      </w:r>
+      <w:r>
+        <w:rPr>
+          <w:rFonts w:ascii="Consolas" w:hAnsi="Consolas"/>
+          <w:color w:val="A31D1D"/>
+          <w:sz w:val="19"/>
+        </w:rPr>
+        <w:t>DescribeImages</w:t>
+      </w:r>
+      <w:r>
+        <w:t xml:space="preserve"> and </w:t>
+      </w:r>
+      <w:r>
+        <w:rPr>
+          <w:rFonts w:ascii="Consolas" w:hAnsi="Consolas"/>
+          <w:color w:val="A31D1D"/>
+          <w:sz w:val="19"/>
+        </w:rPr>
+        <w:t>BatchGetImage</w:t>
+      </w:r>
+      <w:r>
+        <w:t xml:space="preserve"> do. Splitting them into two statements scopes the two that can be scoped.</w:t>
+      </w:r>
+    </w:p>
+    <w:p>
+      <w:pPr>
+        <w:spacing w:after="160"/>
+      </w:pPr>
+      <w:r>
+        <w:rPr>
+          <w:b/>
+        </w:rPr>
+        <w:t>The pattern worth naming.</w:t>
+      </w:r>
+      <w:r>
+        <w:t xml:space="preserve"> A least-privilege policy written as a string pattern is coupled to a naming convention, and nothing enforces that coupling. It fails </w:t>
+      </w:r>
+      <w:r>
+        <w:rPr>
+          <w:i/>
+        </w:rPr>
+        <w:t>open</w:t>
+      </w:r>
+      <w:r>
+        <w:t xml:space="preserve"> in the sense that it is silent: </w:t>
+      </w:r>
+      <w:r>
+        <w:rPr>
+          <w:rFonts w:ascii="Consolas" w:hAnsi="Consolas"/>
+          <w:color w:val="A31D1D"/>
+          <w:sz w:val="19"/>
+        </w:rPr>
+        <w:t>terraform validate</w:t>
+      </w:r>
+      <w:r>
+        <w:t xml:space="preserve">, </w:t>
+      </w:r>
+      <w:r>
+        <w:rPr>
+          <w:rFonts w:ascii="Consolas" w:hAnsi="Consolas"/>
+          <w:color w:val="A31D1D"/>
+          <w:sz w:val="19"/>
+        </w:rPr>
+        <w:t>plan</w:t>
+      </w:r>
+      <w:r>
+        <w:t xml:space="preserve"> and </w:t>
+      </w:r>
+      <w:r>
+        <w:rPr>
+          <w:rFonts w:ascii="Consolas" w:hAnsi="Consolas"/>
+          <w:color w:val="A31D1D"/>
+          <w:sz w:val="19"/>
+        </w:rPr>
+        <w:t>apply</w:t>
+      </w:r>
+      <w:r>
+        <w:t xml:space="preserve"> all succeed, and you find out at push time. Referencing the resource directly makes the coupling structural, so the permission cannot drift away from the thing it authorises.</w:t>
+      </w:r>
+    </w:p>
+    <w:p>
+      <w:pPr>
+        <w:pBdr>
+          <w:bottom w:val="single" w:sz="6" w:color="BFBFBF"/>
+        </w:pBdr>
+        <w:spacing w:after="120"/>
+      </w:pPr>
+    </w:p>
+    <w:p>
+      <w:pPr>
+        <w:pStyle w:val="Heading2"/>
+      </w:pPr>
+      <w:r>
+        <w:rPr>
+          <w:color w:val="1F3964"/>
+        </w:rPr>
+        <w:t>28. An alarm that had never once been true</w:t>
+      </w:r>
+    </w:p>
+    <w:p>
+      <w:pPr>
+        <w:spacing w:after="160"/>
+      </w:pPr>
+      <w:r>
+        <w:rPr>
+          <w:b/>
+        </w:rPr>
+        <w:t>Symptom.</w:t>
+      </w:r>
+      <w:r>
+        <w:t xml:space="preserve"> With the service verifiably healthy -- </w:t>
+      </w:r>
+      <w:r>
+        <w:rPr>
+          <w:rFonts w:ascii="Consolas" w:hAnsi="Consolas"/>
+          <w:color w:val="A31D1D"/>
+          <w:sz w:val="19"/>
+        </w:rPr>
+        <w:t>/health</w:t>
+      </w:r>
+      <w:r>
+        <w:t xml:space="preserve"> returning 200, </w:t>
+      </w:r>
+      <w:r>
+        <w:rPr>
+          <w:rFonts w:ascii="Consolas" w:hAnsi="Consolas"/>
+          <w:color w:val="A31D1D"/>
+          <w:sz w:val="19"/>
+        </w:rPr>
+        <w:t>/readyz</w:t>
+      </w:r>
+      <w:r>
+        <w:t xml:space="preserve"> reaching the database, one task running -- one alarm sat in ALARM:</w:t>
+      </w:r>
+    </w:p>
+    <w:p>
+      <w:pPr>
+        <w:spacing w:after="0" w:before="0"/>
+        <w:ind w:left="360"/>
+        <w:shd w:val="clear" w:color="auto" w:fill="F2F2F2"/>
+      </w:pPr>
+      <w:r>
+        <w:rPr>
+          <w:rFonts w:ascii="Consolas" w:hAnsi="Consolas"/>
+          <w:sz w:val="18"/>
+        </w:rPr>
+        <w:t>meridian-staging-ecs-no-running-tasks   ALARM</w:t>
+      </w:r>
+    </w:p>
+    <w:p>
+      <w:pPr>
+        <w:spacing w:after="0" w:before="0"/>
+        <w:ind w:left="360"/>
+        <w:shd w:val="clear" w:color="auto" w:fill="F2F2F2"/>
+      </w:pPr>
+      <w:r>
+        <w:rPr>
+          <w:rFonts w:ascii="Consolas" w:hAnsi="Consolas"/>
+          <w:sz w:val="18"/>
+        </w:rPr>
+        <w:t>"no datapoints were received for 3 periods and 3 missing datapoints</w:t>
+      </w:r>
+    </w:p>
+    <w:p>
+      <w:pPr>
+        <w:spacing w:after="0" w:before="0"/>
+        <w:ind w:left="360"/>
+        <w:shd w:val="clear" w:color="auto" w:fill="F2F2F2"/>
+      </w:pPr>
+      <w:r>
+        <w:rPr>
+          <w:rFonts w:ascii="Consolas" w:hAnsi="Consolas"/>
+          <w:sz w:val="18"/>
+        </w:rPr>
+        <w:t xml:space="preserve"> were treated as [Breaching]"</w:t>
+      </w:r>
+    </w:p>
+    <w:p>
+      <w:pPr>
+        <w:spacing w:after="80"/>
+      </w:pPr>
+    </w:p>
+    <w:p>
+      <w:pPr>
+        <w:spacing w:after="160"/>
+      </w:pPr>
+      <w:r>
+        <w:rPr>
+          <w:b/>
+        </w:rPr>
+        <w:t>Diagnosis.</w:t>
+      </w:r>
+      <w:r>
+        <w:t xml:space="preserve"> </w:t>
+      </w:r>
+      <w:r>
+        <w:rPr>
+          <w:rFonts w:ascii="Consolas" w:hAnsi="Consolas"/>
+          <w:color w:val="A31D1D"/>
+          <w:sz w:val="19"/>
+        </w:rPr>
+        <w:t>RunningTaskCount</w:t>
+      </w:r>
+      <w:r>
+        <w:t xml:space="preserve"> does not exist in the </w:t>
+      </w:r>
+      <w:r>
+        <w:rPr>
+          <w:rFonts w:ascii="Consolas" w:hAnsi="Consolas"/>
+          <w:color w:val="A31D1D"/>
+          <w:sz w:val="19"/>
+        </w:rPr>
+        <w:t>AWS/ECS</w:t>
+      </w:r>
+      <w:r>
+        <w:t xml:space="preserve"> namespace. That namespace publishes </w:t>
+      </w:r>
+      <w:r>
+        <w:rPr>
+          <w:rFonts w:ascii="Consolas" w:hAnsi="Consolas"/>
+          <w:color w:val="A31D1D"/>
+          <w:sz w:val="19"/>
+        </w:rPr>
+        <w:t>CPUUtilization</w:t>
+      </w:r>
+      <w:r>
+        <w:t xml:space="preserve">, </w:t>
+      </w:r>
+      <w:r>
+        <w:rPr>
+          <w:rFonts w:ascii="Consolas" w:hAnsi="Consolas"/>
+          <w:color w:val="A31D1D"/>
+          <w:sz w:val="19"/>
+        </w:rPr>
+        <w:t>MemoryUtilization</w:t>
+      </w:r>
+      <w:r>
+        <w:t xml:space="preserve"> and </w:t>
+      </w:r>
+      <w:r>
+        <w:rPr>
+          <w:rFonts w:ascii="Consolas" w:hAnsi="Consolas"/>
+          <w:color w:val="A31D1D"/>
+          <w:sz w:val="19"/>
+        </w:rPr>
+        <w:t>LiveTaskCount</w:t>
+      </w:r>
+      <w:r>
+        <w:t xml:space="preserve">. </w:t>
+      </w:r>
+      <w:r>
+        <w:rPr>
+          <w:rFonts w:ascii="Consolas" w:hAnsi="Consolas"/>
+          <w:color w:val="A31D1D"/>
+          <w:sz w:val="19"/>
+        </w:rPr>
+        <w:t>RunningTaskCount</w:t>
+      </w:r>
+      <w:r>
+        <w:t xml:space="preserve"> comes from </w:t>
+      </w:r>
+      <w:r>
+        <w:rPr>
+          <w:rFonts w:ascii="Consolas" w:hAnsi="Consolas"/>
+          <w:color w:val="A31D1D"/>
+          <w:sz w:val="19"/>
+        </w:rPr>
+        <w:t>ECS/ContainerInsights</w:t>
+      </w:r>
+      <w:r>
+        <w:t>.</w:t>
+      </w:r>
+    </w:p>
+    <w:p>
+      <w:pPr>
+        <w:spacing w:after="160"/>
+      </w:pPr>
+      <w:r>
+        <w:t>The alarm had therefore never evaluated a real datapoint in its life. It went into ALARM shortly after creation and stayed there.</w:t>
+      </w:r>
+    </w:p>
+    <w:p>
+      <w:pPr>
+        <w:spacing w:after="160"/>
+      </w:pPr>
+      <w:r>
+        <w:t xml:space="preserve">The same repository already had this right in one place and wrong in another: the CloudWatch dashboard queries </w:t>
+      </w:r>
+      <w:r>
+        <w:rPr>
+          <w:rFonts w:ascii="Consolas" w:hAnsi="Consolas"/>
+          <w:color w:val="A31D1D"/>
+          <w:sz w:val="19"/>
+        </w:rPr>
+        <w:t>ECS/ContainerInsights</w:t>
+      </w:r>
+      <w:r>
+        <w:t xml:space="preserve"> for exactly this metric. Alarm and dashboard disagreed about where the data lives, in adjacent files, and nothing flagged it -- CloudWatch accepts any namespace and metric name as a string, valid or not.</w:t>
+      </w:r>
+    </w:p>
+    <w:p>
+      <w:pPr>
+        <w:spacing w:after="160"/>
+      </w:pPr>
+      <w:r>
+        <w:rPr>
+          <w:b/>
+        </w:rPr>
+        <w:t>Resolution.</w:t>
+      </w:r>
+      <w:r>
+        <w:t xml:space="preserve"> Correct the namespace.</w:t>
+      </w:r>
+    </w:p>
+    <w:p>
+      <w:pPr>
+        <w:spacing w:after="160"/>
+      </w:pPr>
+      <w:r>
+        <w:rPr>
+          <w:b/>
+        </w:rPr>
+        <w:t>The asymmetry worth understanding.</w:t>
+      </w:r>
+      <w:r>
+        <w:t xml:space="preserve"> This alarm sets </w:t>
+      </w:r>
+      <w:r>
+        <w:rPr>
+          <w:rFonts w:ascii="Consolas" w:hAnsi="Consolas"/>
+          <w:color w:val="A31D1D"/>
+          <w:sz w:val="19"/>
+        </w:rPr>
+        <w:t>treat_missing_data = "breaching"</w:t>
+      </w:r>
+      <w:r>
+        <w:t>, on the reasoning that a service reporting no task count at all is worse news than one reporting zero. That reasoning is sound, and it is also what made a typo visible: the alarm screamed continuously until someone looked.</w:t>
+      </w:r>
+    </w:p>
+    <w:p>
+      <w:pPr>
+        <w:spacing w:after="160"/>
+      </w:pPr>
+      <w:r>
+        <w:t xml:space="preserve">Had it been </w:t>
+      </w:r>
+      <w:r>
+        <w:rPr>
+          <w:rFonts w:ascii="Consolas" w:hAnsi="Consolas"/>
+          <w:color w:val="A31D1D"/>
+          <w:sz w:val="19"/>
+        </w:rPr>
+        <w:t>notBreaching</w:t>
+      </w:r>
+      <w:r>
+        <w:t>, the identical mistake would have produced an alarm that sat permanently in OK, silent, and would have stayed silent through a real outage. That is strictly worse and far harder to notice.</w:t>
+      </w:r>
+    </w:p>
+    <w:p>
+      <w:pPr>
+        <w:spacing w:after="160"/>
+      </w:pPr>
+      <w:r>
+        <w:t>Neither setting makes a wrong metric name safe. What does is checking that an alarm has ever evaluated real data:</w:t>
+      </w:r>
+    </w:p>
+    <w:p>
+      <w:pPr>
+        <w:spacing w:after="0" w:before="0"/>
+        <w:ind w:left="360"/>
+        <w:shd w:val="clear" w:color="auto" w:fill="F2F2F2"/>
+      </w:pPr>
+      <w:r>
+        <w:rPr>
+          <w:rFonts w:ascii="Consolas" w:hAnsi="Consolas"/>
+          <w:sz w:val="18"/>
+        </w:rPr>
+        <w:t>aws cloudwatch describe-alarms --alarm-name-prefix &lt;prefix&gt; \</w:t>
+      </w:r>
+    </w:p>
+    <w:p>
+      <w:pPr>
+        <w:spacing w:after="0" w:before="0"/>
+        <w:ind w:left="360"/>
+        <w:shd w:val="clear" w:color="auto" w:fill="F2F2F2"/>
+      </w:pPr>
+      <w:r>
+        <w:rPr>
+          <w:rFonts w:ascii="Consolas" w:hAnsi="Consolas"/>
+          <w:sz w:val="18"/>
+        </w:rPr>
+        <w:t xml:space="preserve">  --query "MetricAlarms[?StateReason!=null].{name:AlarmName,reason:StateReason}"</w:t>
+      </w:r>
+    </w:p>
+    <w:p>
+      <w:pPr>
+        <w:spacing w:after="80"/>
+      </w:pPr>
+    </w:p>
+    <w:p>
+      <w:pPr>
+        <w:spacing w:after="160"/>
+      </w:pPr>
+      <w:r>
+        <w:t>Any alarm whose reason mentions missing datapoints is not monitoring anything. A permanently-firing alarm and a never-firing one are the same defect wearing different clothes, and the noisy one is the lucky case.</w:t>
       </w:r>
     </w:p>
     <w:sectPr>

</xml_diff>